<commit_message>
Exige comprovação de folha na versão simples do contrato
Como a Contratada terá empregados registrados, exigir apenas CND,
CRF/FGTS e CNDT deixava sem cobertura o mês corrente, que é justamente
onde nasce o passivo cobrado em regresso.

- Cláusula 5.3 passa a exigir folha de pagamento, guia de FGTS, DCTFWeb
  ou DARF de INSS e comprovantes de salário do mês anterior.
- Cláusula 4.3 acrescenta o acesso aos registros trabalhistas.
- Recibo mensal passa a declarar a anexação desses comprovantes.

Co-Authored-By: Claude Opus 5 <noreply@anthropic.com>
Claude-Session: https://claude.ai/code/session_01JvuJwy7yY4EnoYMkQynCaG
</commit_message>
<xml_diff>
--- a/docs/juridico/contrato-simples-zeladoria.docx
+++ b/docs/juridico/contrato-simples-zeladoria.docx
@@ -655,7 +655,7 @@
         <w:rPr>
           <w:b w:val="0"/>
         </w:rPr>
-        <w:t xml:space="preserve"> A CONTRATADA informará mensalmente, no recibo do Anexo Único, todas as pessoas que atuaram no período e a natureza do respectivo vínculo.</w:t>
+        <w:t xml:space="preserve"> A CONTRATADA informará mensalmente, no recibo do Anexo Único, todas as pessoas que atuaram no período e a natureza do respectivo vínculo, e franqueará à CONTRATANTE, sempre que solicitado, o acesso aos registros trabalhistas correspondentes.</w:t>
       </w:r>
     </w:p>
     <w:p>
@@ -805,7 +805,19 @@
         <w:rPr>
           <w:b w:val="0"/>
         </w:rPr>
-        <w:t xml:space="preserve"> (Anexo Único) e das certidões CND Federal, CRF/FGTS e CNDT. O pagamento será efetuado até o dia </w:t>
+        <w:t xml:space="preserve"> (Anexo Único) e das certidões CND Federal, CRF/FGTS e CNDT. Possuindo empregados, apresentará ainda, do mês anterior: </w:t>
+      </w:r>
+      <w:r>
+        <w:rPr>
+          <w:b/>
+        </w:rPr>
+        <w:t>folha de pagamento, guia de FGTS quitada, DCTFWeb ou DARF de INSS quitada e comprovantes de pagamento de salários</w:t>
+      </w:r>
+      <w:r>
+        <w:rPr>
+          <w:b w:val="0"/>
+        </w:rPr>
+        <w:t xml:space="preserve">. O pagamento será efetuado até o dia </w:t>
       </w:r>
       <w:r>
         <w:rPr>
@@ -3078,7 +3090,7 @@
         <w:rPr>
           <w:b w:val="0"/>
         </w:rPr>
-        <w:t xml:space="preserve"> com todas as obrigações trabalhistas, previdenciárias e fiscais do período, inclusive quanto às pessoas acima.</w:t>
+        <w:t xml:space="preserve"> com todas as obrigações trabalhistas, previdenciárias e fiscais do período, inclusive quanto às pessoas acima, e anexa a este recibo os comprovantes exigidos na Cláusula 5.3.</w:t>
       </w:r>
     </w:p>
     <w:p>

</xml_diff>

<commit_message>
Fundamenta a necessidade operacional da Casa de Operações
Declarar que a cessão não é salário-utilidade não basta: o que afasta a
natureza remuneratória é a moradia ser fornecida para o trabalho, e não
pelo trabalho. As duas versões passam a registrar a razão técnica —
zona rural de difícil acesso, sem transporte noturno, cobertura contínua
da Janela de Atendimento, chegadas tardias e resposta a intercorrências.

Acrescenta ainda a declaração de que a cessão não foi considerada na
formação do preço, para separá-la da contraprestação.

Co-Authored-By: Claude Opus 5 <noreply@anthropic.com>
Claude-Session: https://claude.ai/code/session_01JvuJwy7yY4EnoYMkQynCaG
</commit_message>
<xml_diff>
--- a/docs/juridico/contrato-simples-zeladoria.docx
+++ b/docs/juridico/contrato-simples-zeladoria.docx
@@ -1121,18 +1121,30 @@
         <w:rPr>
           <w:b/>
         </w:rPr>
-        <w:t>7.1.</w:t>
+        <w:t>7.1. Necessidade operacional.</w:t>
       </w:r>
       <w:r>
         <w:rPr>
           <w:b w:val="0"/>
         </w:rPr>
-        <w:t xml:space="preserve"> Exclusivamente para viabilizar a execução dos serviços e </w:t>
+        <w:t xml:space="preserve"> O empreendimento situa-se em zona rural de difícil acesso, sem transporte público regular no período noturno, e sua operação exige cobertura contínua da Janela de Atendimento, atendimento a chegadas tardias e resposta imediata a intercorrências com hóspedes e a falhas de instalação. Por essa razão </w:t>
       </w:r>
       <w:r>
         <w:rPr>
           <w:b/>
         </w:rPr>
+        <w:t>técnica e operacional</w:t>
+      </w:r>
+      <w:r>
+        <w:rPr>
+          <w:b w:val="0"/>
+        </w:rPr>
+        <w:t xml:space="preserve">, e exclusivamente para viabilizar a execução dos serviços </w:t>
+      </w:r>
+      <w:r>
+        <w:rPr>
+          <w:b/>
+        </w:rPr>
         <w:t>enquanto durar este Contrato</w:t>
       </w:r>
       <w:r>
@@ -1152,6 +1164,44 @@
           <w:b w:val="0"/>
         </w:rPr>
         <w:t>, o uso da unidade denominada Casa de Operações.</w:t>
+      </w:r>
+    </w:p>
+    <w:p>
+      <w:r>
+        <w:rPr>
+          <w:b/>
+        </w:rPr>
+        <w:t>7.1.1.</w:t>
+      </w:r>
+      <w:r>
+        <w:rPr>
+          <w:b w:val="0"/>
+        </w:rPr>
+        <w:t xml:space="preserve"> As Partes declaram que a cessão é concedida </w:t>
+      </w:r>
+      <w:r>
+        <w:rPr>
+          <w:b/>
+        </w:rPr>
+        <w:t>para o trabalho</w:t>
+      </w:r>
+      <w:r>
+        <w:rPr>
+          <w:b w:val="0"/>
+        </w:rPr>
+        <w:t xml:space="preserve">, como instrumento necessário à prestação, e </w:t>
+      </w:r>
+      <w:r>
+        <w:rPr>
+          <w:b/>
+        </w:rPr>
+        <w:t>não pelo trabalho</w:t>
+      </w:r>
+      <w:r>
+        <w:rPr>
+          <w:b w:val="0"/>
+        </w:rPr>
+        <w:t>, não constituindo contraprestação, vantagem, benefício ou parcela remuneratória de qualquer natureza, nem sendo considerada na formação do preço da Cláusula 5.1.</w:t>
       </w:r>
     </w:p>
     <w:p>

</xml_diff>